<commit_message>
Restructure case around asymmetric Workflows A and B.
Move datasets and data dictionary exclusively to Workflow B; require Analysis Requests and Findings Memos; bury efficiency-ethics tension in sources and staff materials rather than participant checklists.

Co-authored-by: Cursor <cursoragent@cursor.com>
</commit_message>
<xml_diff>
--- a/Answer_Key/Word/00_Answer_Key_Index.docx
+++ b/Answer_Key/Word/00_Answer_Key_Index.docx
@@ -189,7 +189,55 @@
           <w:color w:val="222222"/>
           <w:sz w:val="22"/>
         </w:rPr>
-        <w:t>This folder is for facilitators, buddies and assessors only. Do not distribute to participants. It consolidates the case key: every built-in data inconsistency, document-level contradiction, and what strong deliverables should contain.</w:t>
+        <w:t>This folder is for facilitators, buddies and assessors only. Do not distribute to participants. It consolidates the case key: data inconsistencies (Workflow B), document contradictions, expected deliverables under the asymmetric request protocol, and solution paths.</w:t>
+      </w:r>
+    </w:p>
+    <w:p>
+      <w:pPr>
+        <w:pStyle w:val="Heading1"/>
+      </w:pPr>
+      <w:r>
+        <w:rPr>
+          <w:rFonts w:ascii="Calibri" w:hAnsi="Calibri"/>
+          <w:color w:val="1B2A4A"/>
+        </w:rPr>
+        <w:t>Lenses we are testing (never tell participants)</w:t>
+      </w:r>
+    </w:p>
+    <w:p>
+      <w:pPr>
+        <w:pStyle w:val="ListBullet"/>
+        <w:ind w:left="360"/>
+      </w:pPr>
+      <w:r>
+        <w:rPr>
+          <w:rFonts w:ascii="Calibri" w:hAnsi="Calibri"/>
+        </w:rPr>
+        <w:t>Efficiency versus ethics: growth, targets and placement metrics against dignity, quality and who gets left behind.</w:t>
+      </w:r>
+    </w:p>
+    <w:p>
+      <w:pPr>
+        <w:pStyle w:val="ListBullet"/>
+        <w:ind w:left="360"/>
+      </w:pPr>
+      <w:r>
+        <w:rPr>
+          <w:rFonts w:ascii="Calibri" w:hAnsi="Calibri"/>
+        </w:rPr>
+        <w:t>Empathy versus outside-in: recommendations grounded in beneficiary voices versus solving for people whose context the team has not taken seriously.</w:t>
+      </w:r>
+    </w:p>
+    <w:p>
+      <w:pPr>
+        <w:pStyle w:val="ListBullet"/>
+        <w:ind w:left="360"/>
+      </w:pPr>
+      <w:r>
+        <w:rPr>
+          <w:rFonts w:ascii="Calibri" w:hAnsi="Calibri"/>
+        </w:rPr>
+        <w:t>Active querying: A must invent the ask; B must translate. A learning material inconsistencies only through Findings Memos is correct by design.</w:t>
       </w:r>
     </w:p>
     <w:p>

</xml_diff>

<commit_message>
Incorporate review feedback into Programme Guideline and facilitator pack.
Merge handbook and deadlines into one weekly guideline, add Vietnamese-safe fonts, citation/submission rules, rubric bands, and Presentation Day Plan.

Co-authored-by: Cursor <cursoragent@cursor.com>
</commit_message>
<xml_diff>
--- a/Answer_Key/Word/00_Answer_Key_Index.docx
+++ b/Answer_Key/Word/00_Answer_Key_Index.docx
@@ -5,6 +5,7 @@
     <w:p>
       <w:r>
         <w:rPr>
+          <w:rFonts w:ascii="Lexend" w:hAnsi="Lexend" w:eastAsia="Lexend" w:cs="Lexend"/>
           <w:b/>
           <w:color w:val="007A87"/>
           <w:sz w:val="24"/>
@@ -18,6 +19,7 @@
       </w:pPr>
       <w:r>
         <w:rPr>
+          <w:rFonts w:ascii="Lexend" w:hAnsi="Lexend" w:eastAsia="Lexend" w:cs="Lexend"/>
           <w:b/>
           <w:color w:val="1B2A4A"/>
           <w:sz w:val="48"/>
@@ -28,6 +30,7 @@
     <w:p>
       <w:r>
         <w:rPr>
+          <w:rFonts w:ascii="Nunito" w:hAnsi="Nunito" w:eastAsia="Nunito" w:cs="Nunito"/>
           <w:i/>
           <w:color w:val="666666"/>
           <w:sz w:val="24"/>
@@ -52,6 +55,7 @@
           <w:p>
             <w:r>
               <w:rPr>
+                <w:rFonts w:ascii="Nunito" w:hAnsi="Nunito" w:eastAsia="Nunito" w:cs="Nunito"/>
                 <w:b/>
                 <w:color w:val="1B2A4A"/>
                 <w:sz w:val="20"/>
@@ -67,6 +71,7 @@
           <w:p>
             <w:r>
               <w:rPr>
+                <w:rFonts w:ascii="Nunito" w:hAnsi="Nunito" w:eastAsia="Nunito" w:cs="Nunito"/>
                 <w:color w:val="222222"/>
                 <w:sz w:val="20"/>
               </w:rPr>
@@ -83,6 +88,7 @@
           <w:p>
             <w:r>
               <w:rPr>
+                <w:rFonts w:ascii="Nunito" w:hAnsi="Nunito" w:eastAsia="Nunito" w:cs="Nunito"/>
                 <w:b/>
                 <w:color w:val="1B2A4A"/>
                 <w:sz w:val="20"/>
@@ -98,6 +104,7 @@
           <w:p>
             <w:r>
               <w:rPr>
+                <w:rFonts w:ascii="Nunito" w:hAnsi="Nunito" w:eastAsia="Nunito" w:cs="Nunito"/>
                 <w:color w:val="222222"/>
                 <w:sz w:val="20"/>
               </w:rPr>
@@ -114,6 +121,7 @@
           <w:p>
             <w:r>
               <w:rPr>
+                <w:rFonts w:ascii="Nunito" w:hAnsi="Nunito" w:eastAsia="Nunito" w:cs="Nunito"/>
                 <w:b/>
                 <w:color w:val="1B2A4A"/>
                 <w:sz w:val="20"/>
@@ -129,6 +137,7 @@
           <w:p>
             <w:r>
               <w:rPr>
+                <w:rFonts w:ascii="Nunito" w:hAnsi="Nunito" w:eastAsia="Nunito" w:cs="Nunito"/>
                 <w:color w:val="222222"/>
                 <w:sz w:val="20"/>
               </w:rPr>
@@ -145,6 +154,7 @@
           <w:p>
             <w:r>
               <w:rPr>
+                <w:rFonts w:ascii="Nunito" w:hAnsi="Nunito" w:eastAsia="Nunito" w:cs="Nunito"/>
                 <w:b/>
                 <w:color w:val="1B2A4A"/>
                 <w:sz w:val="20"/>
@@ -160,10 +170,11 @@
           <w:p>
             <w:r>
               <w:rPr>
+                <w:rFonts w:ascii="Nunito" w:hAnsi="Nunito" w:eastAsia="Nunito" w:cs="Nunito"/>
                 <w:color w:val="222222"/>
                 <w:sz w:val="20"/>
               </w:rPr>
-              <w:t>2.0 | July 2026</w:t>
+              <w:t>3.0 | July 2026</w:t>
             </w:r>
           </w:p>
         </w:tc>
@@ -183,7 +194,7 @@
       </w:pPr>
       <w:r>
         <w:rPr>
-          <w:rFonts w:ascii="Calibri" w:hAnsi="Calibri"/>
+          <w:rFonts w:ascii="Nunito" w:hAnsi="Nunito" w:eastAsia="Nunito" w:cs="Nunito"/>
           <w:b w:val="0"/>
           <w:i w:val="0"/>
           <w:color w:val="222222"/>
@@ -198,7 +209,7 @@
       </w:pPr>
       <w:r>
         <w:rPr>
-          <w:rFonts w:ascii="Calibri" w:hAnsi="Calibri"/>
+          <w:rFonts w:ascii="Lexend" w:hAnsi="Lexend" w:eastAsia="Lexend" w:cs="Lexend"/>
           <w:color w:val="1B2A4A"/>
         </w:rPr>
         <w:t>Lenses we are testing (never tell participants)</w:t>
@@ -211,7 +222,7 @@
       </w:pPr>
       <w:r>
         <w:rPr>
-          <w:rFonts w:ascii="Calibri" w:hAnsi="Calibri"/>
+          <w:rFonts w:ascii="Nunito" w:hAnsi="Nunito" w:eastAsia="Nunito" w:cs="Nunito"/>
         </w:rPr>
         <w:t>Efficiency versus ethics: growth, targets and placement metrics against dignity, quality and who gets left behind.</w:t>
       </w:r>
@@ -223,7 +234,7 @@
       </w:pPr>
       <w:r>
         <w:rPr>
-          <w:rFonts w:ascii="Calibri" w:hAnsi="Calibri"/>
+          <w:rFonts w:ascii="Nunito" w:hAnsi="Nunito" w:eastAsia="Nunito" w:cs="Nunito"/>
         </w:rPr>
         <w:t>Empathy versus outside-in: recommendations grounded in beneficiary voices versus solving for people whose context the team has not taken seriously.</w:t>
       </w:r>
@@ -235,7 +246,7 @@
       </w:pPr>
       <w:r>
         <w:rPr>
-          <w:rFonts w:ascii="Calibri" w:hAnsi="Calibri"/>
+          <w:rFonts w:ascii="Nunito" w:hAnsi="Nunito" w:eastAsia="Nunito" w:cs="Nunito"/>
         </w:rPr>
         <w:t>Active querying: A must invent the ask; B must translate. A learning material inconsistencies only through Findings Memos is correct by design.</w:t>
       </w:r>
@@ -246,7 +257,7 @@
       </w:pPr>
       <w:r>
         <w:rPr>
-          <w:rFonts w:ascii="Calibri" w:hAnsi="Calibri"/>
+          <w:rFonts w:ascii="Lexend" w:hAnsi="Lexend" w:eastAsia="Lexend" w:cs="Lexend"/>
           <w:color w:val="1B2A4A"/>
         </w:rPr>
         <w:t>Files in this folder</w:t>
@@ -272,6 +283,7 @@
           <w:p>
             <w:r>
               <w:rPr>
+                <w:rFonts w:ascii="Lexend" w:hAnsi="Lexend" w:eastAsia="Lexend" w:cs="Lexend"/>
                 <w:b/>
                 <w:color w:val="FFFFFF"/>
                 <w:sz w:val="20"/>
@@ -288,6 +300,7 @@
           <w:p>
             <w:r>
               <w:rPr>
+                <w:rFonts w:ascii="Lexend" w:hAnsi="Lexend" w:eastAsia="Lexend" w:cs="Lexend"/>
                 <w:b/>
                 <w:color w:val="FFFFFF"/>
                 <w:sz w:val="20"/>
@@ -305,6 +318,7 @@
           <w:p>
             <w:r>
               <w:rPr>
+                <w:rFonts w:ascii="Nunito" w:hAnsi="Nunito" w:eastAsia="Nunito" w:cs="Nunito"/>
                 <w:sz w:val="20"/>
               </w:rPr>
               <w:t>01_Data_Inconsistencies_Register.pdf</w:t>
@@ -318,6 +332,7 @@
           <w:p>
             <w:r>
               <w:rPr>
+                <w:rFonts w:ascii="Nunito" w:hAnsi="Nunito" w:eastAsia="Nunito" w:cs="Nunito"/>
                 <w:sz w:val="20"/>
               </w:rPr>
               <w:t>Every dataset and document inconsistency</w:t>
@@ -334,6 +349,7 @@
           <w:p>
             <w:r>
               <w:rPr>
+                <w:rFonts w:ascii="Nunito" w:hAnsi="Nunito" w:eastAsia="Nunito" w:cs="Nunito"/>
                 <w:sz w:val="20"/>
               </w:rPr>
               <w:t>02_Expected_Deliverables_and_Outcomes.pdf</w:t>
@@ -348,6 +364,7 @@
           <w:p>
             <w:r>
               <w:rPr>
+                <w:rFonts w:ascii="Nunito" w:hAnsi="Nunito" w:eastAsia="Nunito" w:cs="Nunito"/>
                 <w:sz w:val="20"/>
               </w:rPr>
               <w:t>What excellent work looks like per deliverable</w:t>
@@ -363,6 +380,7 @@
           <w:p>
             <w:r>
               <w:rPr>
+                <w:rFonts w:ascii="Nunito" w:hAnsi="Nunito" w:eastAsia="Nunito" w:cs="Nunito"/>
                 <w:sz w:val="20"/>
               </w:rPr>
               <w:t>03_Strategic_Solution_Paths.pdf</w:t>
@@ -376,6 +394,7 @@
           <w:p>
             <w:r>
               <w:rPr>
+                <w:rFonts w:ascii="Nunito" w:hAnsi="Nunito" w:eastAsia="Nunito" w:cs="Nunito"/>
                 <w:sz w:val="20"/>
               </w:rPr>
               <w:t>Defensible recommendation paths and red lines</w:t>
@@ -392,6 +411,7 @@
           <w:p>
             <w:r>
               <w:rPr>
+                <w:rFonts w:ascii="Nunito" w:hAnsi="Nunito" w:eastAsia="Nunito" w:cs="Nunito"/>
                 <w:sz w:val="20"/>
               </w:rPr>
               <w:t>Data_Inconsistencies_Register.xlsx</w:t>
@@ -406,6 +426,7 @@
           <w:p>
             <w:r>
               <w:rPr>
+                <w:rFonts w:ascii="Nunito" w:hAnsi="Nunito" w:eastAsia="Nunito" w:cs="Nunito"/>
                 <w:sz w:val="20"/>
               </w:rPr>
               <w:t>Searchable register for marking and debrief</w:t>
@@ -421,7 +442,7 @@
       </w:pPr>
       <w:r>
         <w:rPr>
-          <w:rFonts w:ascii="Calibri" w:hAnsi="Calibri"/>
+          <w:rFonts w:ascii="Lexend" w:hAnsi="Lexend" w:eastAsia="Lexend" w:cs="Lexend"/>
           <w:color w:val="1B2A4A"/>
         </w:rPr>
         <w:t>How to use this pack</w:t>
@@ -434,7 +455,7 @@
       </w:pPr>
       <w:r>
         <w:rPr>
-          <w:rFonts w:ascii="Calibri" w:hAnsi="Calibri"/>
+          <w:rFonts w:ascii="Nunito" w:hAnsi="Nunito" w:eastAsia="Nunito" w:cs="Nunito"/>
         </w:rPr>
         <w:t>Before Week 1: read the data inconsistencies register so you know what teams should find.</w:t>
       </w:r>
@@ -446,7 +467,7 @@
       </w:pPr>
       <w:r>
         <w:rPr>
-          <w:rFonts w:ascii="Calibri" w:hAnsi="Calibri"/>
+          <w:rFonts w:ascii="Nunito" w:hAnsi="Nunito" w:eastAsia="Nunito" w:cs="Nunito"/>
         </w:rPr>
         <w:t>During marking: use Expected Deliverables for criterion-level judgement.</w:t>
       </w:r>
@@ -458,7 +479,7 @@
       </w:pPr>
       <w:r>
         <w:rPr>
-          <w:rFonts w:ascii="Calibri" w:hAnsi="Calibri"/>
+          <w:rFonts w:ascii="Nunito" w:hAnsi="Nunito" w:eastAsia="Nunito" w:cs="Nunito"/>
         </w:rPr>
         <w:t>In debrief: reveal that multiple solution paths were valid (see document 03).</w:t>
       </w:r>
@@ -470,7 +491,7 @@
       </w:pPr>
       <w:r>
         <w:rPr>
-          <w:rFonts w:ascii="Calibri" w:hAnsi="Calibri"/>
+          <w:rFonts w:ascii="Nunito" w:hAnsi="Nunito" w:eastAsia="Nunito" w:cs="Nunito"/>
         </w:rPr>
         <w:t>Operational facilitation remains in Facilitators/ (buddy hints, rubric, debrief flow).</w:t>
       </w:r>
@@ -852,7 +873,7 @@
       <w:spacing w:after="120" w:line="276" w:lineRule="auto"/>
     </w:pPr>
     <w:rPr>
-      <w:rFonts w:ascii="Calibri" w:hAnsi="Calibri"/>
+      <w:rFonts w:ascii="Nunito" w:hAnsi="Nunito" w:eastAsia="Nunito" w:cs="Nunito"/>
       <w:color w:val="222222"/>
       <w:sz w:val="22"/>
     </w:rPr>

</xml_diff>

<commit_message>
Ready the GBF case pack for rollout with the A↔B evidence loop.
Add Data Estate Brief → Demand Brief → Analysis Plan before R/FM, align Week 3 timing and gated handoff logistics, and rebuild participant, facilitator, and answer-key materials for consistency.

Co-authored-by: Cursor <cursoragent@cursor.com>
</commit_message>
<xml_diff>
--- a/Answer_Key/Word/00_Answer_Key_Index.docx
+++ b/Answer_Key/Word/00_Answer_Key_Index.docx
@@ -200,7 +200,7 @@
           <w:color w:val="222222"/>
           <w:sz w:val="22"/>
         </w:rPr>
-        <w:t>This folder is for facilitators, buddies and assessors only. Do not distribute to participants. It consolidates the case key: data inconsistencies (Workflow B), document contradictions, expected deliverables under the asymmetric request protocol, and solution paths.</w:t>
+        <w:t>This folder is for facilitators, buddies and assessors only. Do not distribute to participants. It consolidates the case key: data inconsistencies (Workflow B), document contradictions, expected deliverables under the A↔B evidence loop (Estate → Demand → Plan → R/FM), and solution paths.</w:t>
       </w:r>
     </w:p>
     <w:p>
@@ -248,7 +248,7 @@
         <w:rPr>
           <w:rFonts w:ascii="Nunito" w:hAnsi="Nunito" w:eastAsia="Nunito" w:cs="Nunito"/>
         </w:rPr>
-        <w:t>Active querying: A must invent the ask; B must translate. A learning material inconsistencies only through Findings Memos is correct by design.</w:t>
+        <w:t>Active querying: B briefs the data estate; A states demand; B owns the analysis plan; A learns material inconsistencies only through Findings Memos (correct by design).</w:t>
       </w:r>
     </w:p>
     <w:p>
@@ -469,7 +469,7 @@
         <w:rPr>
           <w:rFonts w:ascii="Nunito" w:hAnsi="Nunito" w:eastAsia="Nunito" w:cs="Nunito"/>
         </w:rPr>
-        <w:t>During marking: use Expected Deliverables for criterion-level judgement.</w:t>
+        <w:t>During marking: use Expected Deliverables for criterion-level judgement (including the online Handoff Checklist standard).</w:t>
       </w:r>
     </w:p>
     <w:p>
@@ -493,7 +493,7 @@
         <w:rPr>
           <w:rFonts w:ascii="Nunito" w:hAnsi="Nunito" w:eastAsia="Nunito" w:cs="Nunito"/>
         </w:rPr>
-        <w:t>Operational facilitation remains in Facilitators/ (buddy hints, rubric, debrief flow).</w:t>
+        <w:t>Operational facilitation remains in Facilitators/ (buddy hints, rubric, kickoff logistics, debrief flow). Do not distribute Answer_Key or Facilitators to participants.</w:t>
       </w:r>
     </w:p>
     <w:sectPr>

</xml_diff>